<commit_message>
Update Week 3 Quiz with correct answers marked
</commit_message>
<xml_diff>
--- a/documents/Week3_Quiz.docx
+++ b/documents/Week3_Quiz.docx
@@ -27,6 +27,21 @@
     <w:p>
       <w:pPr>
         <w:shd w:fill="FFF3E6" w:val="clear"/>
+        <w:spacing w:after="200"/>
+        <w:jc w:val="center"/>
+      </w:pPr>
+      <w:r>
+        <w:rPr>
+          <w:b/>
+          <w:bCs/>
+          <w:color w:val="FF6600"/>
+        </w:rPr>
+        <w:t xml:space="preserve">Total Points: 100 (10 points each)</w:t>
+      </w:r>
+    </w:p>
+    <w:p>
+      <w:pPr>
+        <w:shd w:fill="E6F7F1" w:val="clear"/>
         <w:spacing w:after="400"/>
         <w:jc w:val="center"/>
       </w:pPr>
@@ -34,9 +49,9 @@
         <w:rPr>
           <w:b/>
           <w:bCs/>
-          <w:color w:val="FF6600"/>
-        </w:rPr>
-        <w:t xml:space="preserve">Total Points: 100 (10 points each)</w:t>
+          <w:color w:val="019E7C"/>
+        </w:rPr>
+        <w:t xml:space="preserve">Correct answers are marked with ✓</w:t>
       </w:r>
     </w:p>
     <w:p>
@@ -85,7 +100,12 @@
         </w:numPr>
       </w:pPr>
       <w:r>
-        <w:t xml:space="preserve">Income Statement, Balance Sheet, Cash Flow Statement</w:t>
+        <w:rPr>
+          <w:b/>
+          <w:bCs/>
+          <w:color w:val="019E7C"/>
+        </w:rPr>
+        <w:t xml:space="preserve">Income Statement, Balance Sheet, Cash Flow Statement ✓</w:t>
       </w:r>
     </w:p>
     <w:p>
@@ -122,7 +142,12 @@
         </w:numPr>
       </w:pPr>
       <w:r>
-        <w:t xml:space="preserve">Revenue, expenses, and profit/loss over a period of time</w:t>
+        <w:rPr>
+          <w:b/>
+          <w:bCs/>
+          <w:color w:val="019E7C"/>
+        </w:rPr>
+        <w:t xml:space="preserve">Revenue, expenses, and profit/loss over a period of time ✓</w:t>
       </w:r>
     </w:p>
     <w:p>
@@ -195,7 +220,12 @@
         </w:numPr>
       </w:pPr>
       <w:r>
-        <w:t xml:space="preserve">To identify the difference between your current state and your goal state</w:t>
+        <w:rPr>
+          <w:b/>
+          <w:bCs/>
+          <w:color w:val="019E7C"/>
+        </w:rPr>
+        <w:t xml:space="preserve">To identify the difference between your current state and your goal state ✓</w:t>
       </w:r>
     </w:p>
     <w:p>
@@ -268,7 +298,12 @@
         </w:numPr>
       </w:pPr>
       <w:r>
-        <w:t xml:space="preserve">Assets, liabilities, and equity at a specific point in time</w:t>
+        <w:rPr>
+          <w:b/>
+          <w:bCs/>
+          <w:color w:val="019E7C"/>
+        </w:rPr>
+        <w:t xml:space="preserve">Assets, liabilities, and equity at a specific point in time ✓</w:t>
       </w:r>
     </w:p>
     <w:p>
@@ -305,7 +340,12 @@
         </w:numPr>
       </w:pPr>
       <w:r>
-        <w:t xml:space="preserve">The difference between your current revenue and your target revenue</w:t>
+        <w:rPr>
+          <w:b/>
+          <w:bCs/>
+          <w:color w:val="019E7C"/>
+        </w:rPr>
+        <w:t xml:space="preserve">The difference between your current revenue and your target revenue ✓</w:t>
       </w:r>
     </w:p>
     <w:p>
@@ -378,7 +418,12 @@
         </w:numPr>
       </w:pPr>
       <w:r>
-        <w:t xml:space="preserve">Current state, goal state, gap measurement, actions, and timeline</w:t>
+        <w:rPr>
+          <w:b/>
+          <w:bCs/>
+          <w:color w:val="019E7C"/>
+        </w:rPr>
+        <w:t xml:space="preserve">Current state, goal state, gap measurement, actions, and timeline ✓</w:t>
       </w:r>
     </w:p>
     <w:p>
@@ -427,7 +472,12 @@
         </w:numPr>
       </w:pPr>
       <w:r>
-        <w:t xml:space="preserve">They provide context for what gaps to prioritize and how to approach them</w:t>
+        <w:rPr>
+          <w:b/>
+          <w:bCs/>
+          <w:color w:val="019E7C"/>
+        </w:rPr>
+        <w:t xml:space="preserve">They provide context for what gaps to prioritize and how to approach them ✓</w:t>
       </w:r>
     </w:p>
     <w:p>
@@ -512,7 +562,12 @@
         </w:numPr>
       </w:pPr>
       <w:r>
-        <w:t xml:space="preserve">Money moving in and out of the business over time</w:t>
+        <w:rPr>
+          <w:b/>
+          <w:bCs/>
+          <w:color w:val="019E7C"/>
+        </w:rPr>
+        <w:t xml:space="preserve">Money moving in and out of the business over time ✓</w:t>
       </w:r>
     </w:p>
     <w:p>
@@ -561,7 +616,12 @@
         </w:numPr>
       </w:pPr>
       <w:r>
-        <w:t xml:space="preserve">Vague goals lead to vague results—specific measurements enable actionable plans</w:t>
+        <w:rPr>
+          <w:b/>
+          <w:bCs/>
+          <w:color w:val="019E7C"/>
+        </w:rPr>
+        <w:t xml:space="preserve">Vague goals lead to vague results—specific measurements enable actionable plans ✓</w:t>
       </w:r>
     </w:p>
     <w:p>
@@ -610,7 +670,12 @@
         </w:numPr>
       </w:pPr>
       <w:r>
-        <w:t xml:space="preserve">Whether you have the funds, people, or equipment needed to reach your goals</w:t>
+        <w:rPr>
+          <w:b/>
+          <w:bCs/>
+          <w:color w:val="019E7C"/>
+        </w:rPr>
+        <w:t xml:space="preserve">Whether you have the funds, people, or equipment needed to reach your goals ✓</w:t>
       </w:r>
     </w:p>
     <w:p>

</xml_diff>